<commit_message>
Normalize MED case compliance
</commit_message>
<xml_diff>
--- a/18_DOCX/MED_CASES_0001_0008.docx
+++ b/18_DOCX/MED_CASES_0001_0008.docx
@@ -7,14 +7,61 @@
         <w:pStyle w:val="Heading1"/>
       </w:pPr>
       <w:r>
-        <w:t>MED_CASES_0001_0008 - Primeiro ciclo de estudos de caso MED</w:t>
-      </w:r>
-    </w:p>
-    <w:p>
-      <w:r>
-        <w:t>————————————————————————</w:t>
-      </w:r>
-    </w:p>
+        <w:t>MED_CASES_0001_0008 - Estudos de caso MED</w:t>
+      </w:r>
+    </w:p>
+    <w:p/>
+    <w:p>
+      <w:pPr>
+        <w:pStyle w:val="Heading2"/>
+      </w:pPr>
+      <w:r>
+        <w:t>Controle</w:t>
+      </w:r>
+    </w:p>
+    <w:p/>
+    <w:p>
+      <w:pPr>
+        <w:pStyle w:val="ListBullet"/>
+      </w:pPr>
+      <w:r>
+        <w:t>Versão: 0.2</w:t>
+      </w:r>
+    </w:p>
+    <w:p>
+      <w:pPr>
+        <w:pStyle w:val="ListBullet"/>
+      </w:pPr>
+      <w:r>
+        <w:t>Data: 2026-06-26</w:t>
+      </w:r>
+    </w:p>
+    <w:p>
+      <w:pPr>
+        <w:pStyle w:val="ListBullet"/>
+      </w:pPr>
+      <w:r>
+        <w:t>Autor: JP-BR Insurance Knowledge Base</w:t>
+      </w:r>
+    </w:p>
+    <w:p>
+      <w:pPr>
+        <w:pStyle w:val="ListBullet"/>
+      </w:pPr>
+      <w:r>
+        <w:t>Histórico: Consolidação atualizada com limite comercial/compliance.</w:t>
+      </w:r>
+    </w:p>
+    <w:p/>
+    <w:p>
+      <w:pPr>
+        <w:pStyle w:val="Heading2"/>
+      </w:pPr>
+      <w:r>
+        <w:t>Conteúdo consolidado</w:t>
+      </w:r>
+    </w:p>
+    <w:p/>
     <w:p>
       <w:pPr>
         <w:pStyle w:val="Heading1"/>
@@ -23,6 +70,7 @@
         <w:t>CASE-MED-0001 - Cliente quer entender diferença entre seguro médico e sistema público</w:t>
       </w:r>
     </w:p>
+    <w:p/>
     <w:p>
       <w:pPr>
         <w:pStyle w:val="Heading2"/>
@@ -31,12 +79,13 @@
         <w:t>Controle</w:t>
       </w:r>
     </w:p>
+    <w:p/>
     <w:p>
       <w:pPr>
         <w:pStyle w:val="ListBullet"/>
       </w:pPr>
       <w:r>
-        <w:t>Versão: 0.1</w:t>
+        <w:t>Versão: 0.2</w:t>
       </w:r>
     </w:p>
     <w:p>
@@ -60,9 +109,10 @@
         <w:pStyle w:val="ListBullet"/>
       </w:pPr>
       <w:r>
-        <w:t>Histórico: Criação inicial.</w:t>
-      </w:r>
-    </w:p>
+        <w:t>Histórico: Criação inicial; inclusão de limite comercial/compliance.</w:t>
+      </w:r>
+    </w:p>
+    <w:p/>
     <w:p>
       <w:pPr>
         <w:pStyle w:val="Heading2"/>
@@ -71,11 +121,13 @@
         <w:t>Código</w:t>
       </w:r>
     </w:p>
+    <w:p/>
     <w:p>
       <w:r>
         <w:t>CASE-MED-0001</w:t>
       </w:r>
     </w:p>
+    <w:p/>
     <w:p>
       <w:pPr>
         <w:pStyle w:val="Heading2"/>
@@ -84,11 +136,13 @@
         <w:t>Produto ou categoria</w:t>
       </w:r>
     </w:p>
+    <w:p/>
     <w:p>
       <w:r>
         <w:t>MED</w:t>
       </w:r>
     </w:p>
+    <w:p/>
     <w:p>
       <w:pPr>
         <w:pStyle w:val="Heading2"/>
@@ -97,11 +151,13 @@
         <w:t>Situação</w:t>
       </w:r>
     </w:p>
+    <w:p/>
     <w:p>
       <w:r>
         <w:t>Cliente quer entender diferença entre seguro médico e sistema público.</w:t>
       </w:r>
     </w:p>
+    <w:p/>
     <w:p>
       <w:pPr>
         <w:pStyle w:val="Heading2"/>
@@ -110,11 +166,13 @@
         <w:t>Problema</w:t>
       </w:r>
     </w:p>
+    <w:p/>
     <w:p>
       <w:r>
         <w:t>Cliente pode confundir seguro médico privado com sistema público, benefício contratado ou reembolso amplo de despesas.</w:t>
       </w:r>
     </w:p>
+    <w:p/>
     <w:p>
       <w:pPr>
         <w:pStyle w:val="Heading2"/>
@@ -123,11 +181,13 @@
         <w:t>Análise</w:t>
       </w:r>
     </w:p>
+    <w:p/>
     <w:p>
       <w:r>
         <w:t>O seguro médico privado deve ser explicado por benefício, condição de pagamento, limite, declaração de saúde e data de início.</w:t>
       </w:r>
     </w:p>
+    <w:p/>
     <w:p>
       <w:pPr>
         <w:pStyle w:val="Heading2"/>
@@ -136,11 +196,13 @@
         <w:t>Orientação ao corretor</w:t>
       </w:r>
     </w:p>
+    <w:p/>
     <w:p>
       <w:r>
         <w:t>Confirmar objetivo do cliente, histórico de saúde, benefícios desejados e limites de cobertura antes de comparar preço.</w:t>
       </w:r>
     </w:p>
+    <w:p/>
     <w:p>
       <w:pPr>
         <w:pStyle w:val="Heading2"/>
@@ -149,11 +211,13 @@
         <w:t>Como explicar ao cliente brasileiro</w:t>
       </w:r>
     </w:p>
+    <w:p/>
     <w:p>
       <w:r>
         <w:t>Vamos separar o que é sistema público e o que é benefício do seguro privado, porque cada um funciona de forma diferente.</w:t>
       </w:r>
     </w:p>
+    <w:p/>
     <w:p>
       <w:pPr>
         <w:pStyle w:val="Heading2"/>
@@ -162,19 +226,37 @@
         <w:t>Resultado esperado</w:t>
       </w:r>
     </w:p>
+    <w:p/>
     <w:p>
       <w:r>
         <w:t>Cliente entende a finalidade do seguro médico e evita expectativa incorreta sobre pagamento.</w:t>
       </w:r>
     </w:p>
+    <w:p/>
     <w:p>
       <w:pPr>
         <w:pStyle w:val="Heading2"/>
       </w:pPr>
       <w:r>
+        <w:t>Limite comercial/compliance</w:t>
+      </w:r>
+    </w:p>
+    <w:p/>
+    <w:p>
+      <w:r>
+        <w:t>O corretor deve usar este caso como orientação de atendimento, sem prometer aceitação, cobertura, pagamento, prazo, diagnóstico, enquadramento médico ou resultado de análise. A decisão final depende do contrato, declaração de saúde, documentos médicos, datas relevantes e avaliação da seguradora.</w:t>
+      </w:r>
+    </w:p>
+    <w:p/>
+    <w:p>
+      <w:pPr>
+        <w:pStyle w:val="Heading2"/>
+      </w:pPr>
+      <w:r>
         <w:t>Termos relacionados</w:t>
       </w:r>
     </w:p>
+    <w:p/>
     <w:p>
       <w:pPr>
         <w:pStyle w:val="ListBullet"/>
@@ -191,6 +273,7 @@
         <w:t>MED-0002 - 入院給付金 - Benefício por internação</w:t>
       </w:r>
     </w:p>
+    <w:p/>
     <w:p>
       <w:pPr>
         <w:pStyle w:val="Heading2"/>
@@ -199,6 +282,7 @@
         <w:t>FAQs relacionadas</w:t>
       </w:r>
     </w:p>
+    <w:p/>
     <w:p>
       <w:pPr>
         <w:pStyle w:val="ListBullet"/>
@@ -215,6 +299,7 @@
         <w:t>FAQ-MED-0002</w:t>
       </w:r>
     </w:p>
+    <w:p/>
     <w:p>
       <w:pPr>
         <w:pStyle w:val="Heading2"/>
@@ -223,6 +308,7 @@
         <w:t>Diálogos relacionados</w:t>
       </w:r>
     </w:p>
+    <w:p/>
     <w:p>
       <w:pPr>
         <w:pStyle w:val="ListBullet"/>
@@ -231,6 +317,7 @@
         <w:t>DIALOGUE-MED-0001</w:t>
       </w:r>
     </w:p>
+    <w:p/>
     <w:p>
       <w:pPr>
         <w:pStyle w:val="Heading2"/>
@@ -239,6 +326,7 @@
         <w:t>Referências cruzadas</w:t>
       </w:r>
     </w:p>
+    <w:p/>
     <w:p>
       <w:pPr>
         <w:pStyle w:val="ListBullet"/>
@@ -279,6 +367,7 @@
         <w:t>DIALOGUE-MED-0001</w:t>
       </w:r>
     </w:p>
+    <w:p/>
     <w:p>
       <w:pPr>
         <w:pStyle w:val="Heading2"/>
@@ -287,6 +376,7 @@
         <w:t>Referências</w:t>
       </w:r>
     </w:p>
+    <w:p/>
     <w:p>
       <w:pPr>
         <w:pStyle w:val="ListBullet"/>
@@ -295,6 +385,7 @@
         <w:t>Documento interno: `EDITORIAL_RULES.md`</w:t>
       </w:r>
     </w:p>
+    <w:p/>
     <w:p>
       <w:pPr>
         <w:pStyle w:val="Heading2"/>
@@ -303,6 +394,7 @@
         <w:t>Tags</w:t>
       </w:r>
     </w:p>
+    <w:p/>
     <w:p>
       <w:pPr>
         <w:pStyle w:val="ListBullet"/>
@@ -335,6 +427,7 @@
         <w:t>atendimento</w:t>
       </w:r>
     </w:p>
+    <w:p/>
     <w:p>
       <w:pPr>
         <w:pStyle w:val="Heading2"/>
@@ -343,6 +436,7 @@
         <w:t>Veja também</w:t>
       </w:r>
     </w:p>
+    <w:p/>
     <w:p>
       <w:pPr>
         <w:pStyle w:val="ListBullet"/>
@@ -351,6 +445,7 @@
         <w:t>`14_FAQ/MED/FAQ-MED-0001.md`</w:t>
       </w:r>
     </w:p>
+    <w:p/>
     <w:p>
       <w:pPr>
         <w:pStyle w:val="Heading2"/>
@@ -359,6 +454,7 @@
         <w:t>Histórico de revisão</w:t>
       </w:r>
     </w:p>
+    <w:p/>
     <w:p>
       <w:r>
         <w:t>| Data | Versão | Autor | Alteração |</w:t>
@@ -376,9 +472,16 @@
     </w:p>
     <w:p>
       <w:r>
-        <w:t>————————————————————————</w:t>
-      </w:r>
-    </w:p>
+        <w:t>| 2026-06-26 | 0.2 | JP-BR Insurance Knowledge Base | Inclusão de limite comercial/compliance para uso seguro em atendimento e NotebookLM. |</w:t>
+      </w:r>
+    </w:p>
+    <w:p/>
+    <w:p>
+      <w:r>
+        <w:br w:type="page"/>
+      </w:r>
+    </w:p>
+    <w:p/>
     <w:p>
       <w:pPr>
         <w:pStyle w:val="Heading1"/>
@@ -387,6 +490,7 @@
         <w:t>CASE-MED-0002 - Cliente pergunta se cirurgia e tratamento ambulatorial são cobertos</w:t>
       </w:r>
     </w:p>
+    <w:p/>
     <w:p>
       <w:pPr>
         <w:pStyle w:val="Heading2"/>
@@ -395,12 +499,13 @@
         <w:t>Controle</w:t>
       </w:r>
     </w:p>
+    <w:p/>
     <w:p>
       <w:pPr>
         <w:pStyle w:val="ListBullet"/>
       </w:pPr>
       <w:r>
-        <w:t>Versão: 0.1</w:t>
+        <w:t>Versão: 0.2</w:t>
       </w:r>
     </w:p>
     <w:p>
@@ -424,9 +529,10 @@
         <w:pStyle w:val="ListBullet"/>
       </w:pPr>
       <w:r>
-        <w:t>Histórico: Criação inicial.</w:t>
-      </w:r>
-    </w:p>
+        <w:t>Histórico: Criação inicial; inclusão de limite comercial/compliance.</w:t>
+      </w:r>
+    </w:p>
+    <w:p/>
     <w:p>
       <w:pPr>
         <w:pStyle w:val="Heading2"/>
@@ -435,11 +541,13 @@
         <w:t>Código</w:t>
       </w:r>
     </w:p>
+    <w:p/>
     <w:p>
       <w:r>
         <w:t>CASE-MED-0002</w:t>
       </w:r>
     </w:p>
+    <w:p/>
     <w:p>
       <w:pPr>
         <w:pStyle w:val="Heading2"/>
@@ -448,11 +556,13 @@
         <w:t>Produto ou categoria</w:t>
       </w:r>
     </w:p>
+    <w:p/>
     <w:p>
       <w:r>
         <w:t>MED</w:t>
       </w:r>
     </w:p>
+    <w:p/>
     <w:p>
       <w:pPr>
         <w:pStyle w:val="Heading2"/>
@@ -461,11 +571,13 @@
         <w:t>Situação</w:t>
       </w:r>
     </w:p>
+    <w:p/>
     <w:p>
       <w:r>
         <w:t>Cliente pergunta se cirurgia e tratamento ambulatorial são cobertos.</w:t>
       </w:r>
     </w:p>
+    <w:p/>
     <w:p>
       <w:pPr>
         <w:pStyle w:val="Heading2"/>
@@ -474,11 +586,13 @@
         <w:t>Problema</w:t>
       </w:r>
     </w:p>
+    <w:p/>
     <w:p>
       <w:r>
         <w:t>Cliente pode confundir seguro médico privado com sistema público, benefício contratado ou reembolso amplo de despesas.</w:t>
       </w:r>
     </w:p>
+    <w:p/>
     <w:p>
       <w:pPr>
         <w:pStyle w:val="Heading2"/>
@@ -487,11 +601,13 @@
         <w:t>Análise</w:t>
       </w:r>
     </w:p>
+    <w:p/>
     <w:p>
       <w:r>
         <w:t>O seguro médico privado deve ser explicado por benefício, condição de pagamento, limite, declaração de saúde e data de início.</w:t>
       </w:r>
     </w:p>
+    <w:p/>
     <w:p>
       <w:pPr>
         <w:pStyle w:val="Heading2"/>
@@ -500,11 +616,13 @@
         <w:t>Orientação ao corretor</w:t>
       </w:r>
     </w:p>
+    <w:p/>
     <w:p>
       <w:r>
         <w:t>Confirmar objetivo do cliente, histórico de saúde, benefícios desejados e limites de cobertura antes de comparar preço.</w:t>
       </w:r>
     </w:p>
+    <w:p/>
     <w:p>
       <w:pPr>
         <w:pStyle w:val="Heading2"/>
@@ -513,11 +631,13 @@
         <w:t>Como explicar ao cliente brasileiro</w:t>
       </w:r>
     </w:p>
+    <w:p/>
     <w:p>
       <w:r>
         <w:t>Vamos separar o que é sistema público e o que é benefício do seguro privado, porque cada um funciona de forma diferente.</w:t>
       </w:r>
     </w:p>
+    <w:p/>
     <w:p>
       <w:pPr>
         <w:pStyle w:val="Heading2"/>
@@ -526,19 +646,37 @@
         <w:t>Resultado esperado</w:t>
       </w:r>
     </w:p>
+    <w:p/>
     <w:p>
       <w:r>
         <w:t>Cliente entende a finalidade do seguro médico e evita expectativa incorreta sobre pagamento.</w:t>
       </w:r>
     </w:p>
+    <w:p/>
     <w:p>
       <w:pPr>
         <w:pStyle w:val="Heading2"/>
       </w:pPr>
       <w:r>
+        <w:t>Limite comercial/compliance</w:t>
+      </w:r>
+    </w:p>
+    <w:p/>
+    <w:p>
+      <w:r>
+        <w:t>O corretor deve usar este caso como orientação de atendimento, sem prometer aceitação, cobertura, pagamento, prazo, diagnóstico, enquadramento médico ou resultado de análise. A decisão final depende do contrato, declaração de saúde, documentos médicos, datas relevantes e avaliação da seguradora.</w:t>
+      </w:r>
+    </w:p>
+    <w:p/>
+    <w:p>
+      <w:pPr>
+        <w:pStyle w:val="Heading2"/>
+      </w:pPr>
+      <w:r>
         <w:t>Termos relacionados</w:t>
       </w:r>
     </w:p>
+    <w:p/>
     <w:p>
       <w:pPr>
         <w:pStyle w:val="ListBullet"/>
@@ -555,6 +693,7 @@
         <w:t>MED-0004 - 通院給付金 - Benefício por tratamento ambulatorial</w:t>
       </w:r>
     </w:p>
+    <w:p/>
     <w:p>
       <w:pPr>
         <w:pStyle w:val="Heading2"/>
@@ -563,6 +702,7 @@
         <w:t>FAQs relacionadas</w:t>
       </w:r>
     </w:p>
+    <w:p/>
     <w:p>
       <w:pPr>
         <w:pStyle w:val="ListBullet"/>
@@ -579,6 +719,7 @@
         <w:t>FAQ-MED-0004</w:t>
       </w:r>
     </w:p>
+    <w:p/>
     <w:p>
       <w:pPr>
         <w:pStyle w:val="Heading2"/>
@@ -587,6 +728,7 @@
         <w:t>Diálogos relacionados</w:t>
       </w:r>
     </w:p>
+    <w:p/>
     <w:p>
       <w:pPr>
         <w:pStyle w:val="ListBullet"/>
@@ -595,6 +737,7 @@
         <w:t>DIALOGUE-MED-0001</w:t>
       </w:r>
     </w:p>
+    <w:p/>
     <w:p>
       <w:pPr>
         <w:pStyle w:val="Heading2"/>
@@ -603,6 +746,7 @@
         <w:t>Referências cruzadas</w:t>
       </w:r>
     </w:p>
+    <w:p/>
     <w:p>
       <w:pPr>
         <w:pStyle w:val="ListBullet"/>
@@ -643,6 +787,7 @@
         <w:t>DIALOGUE-MED-0001</w:t>
       </w:r>
     </w:p>
+    <w:p/>
     <w:p>
       <w:pPr>
         <w:pStyle w:val="Heading2"/>
@@ -651,6 +796,7 @@
         <w:t>Referências</w:t>
       </w:r>
     </w:p>
+    <w:p/>
     <w:p>
       <w:pPr>
         <w:pStyle w:val="ListBullet"/>
@@ -659,6 +805,7 @@
         <w:t>Documento interno: `EDITORIAL_RULES.md`</w:t>
       </w:r>
     </w:p>
+    <w:p/>
     <w:p>
       <w:pPr>
         <w:pStyle w:val="Heading2"/>
@@ -667,6 +814,7 @@
         <w:t>Tags</w:t>
       </w:r>
     </w:p>
+    <w:p/>
     <w:p>
       <w:pPr>
         <w:pStyle w:val="ListBullet"/>
@@ -699,6 +847,7 @@
         <w:t>atendimento</w:t>
       </w:r>
     </w:p>
+    <w:p/>
     <w:p>
       <w:pPr>
         <w:pStyle w:val="Heading2"/>
@@ -707,6 +856,7 @@
         <w:t>Veja também</w:t>
       </w:r>
     </w:p>
+    <w:p/>
     <w:p>
       <w:pPr>
         <w:pStyle w:val="ListBullet"/>
@@ -715,6 +865,7 @@
         <w:t>`14_FAQ/MED/FAQ-MED-0003.md`</w:t>
       </w:r>
     </w:p>
+    <w:p/>
     <w:p>
       <w:pPr>
         <w:pStyle w:val="Heading2"/>
@@ -723,6 +874,7 @@
         <w:t>Histórico de revisão</w:t>
       </w:r>
     </w:p>
+    <w:p/>
     <w:p>
       <w:r>
         <w:t>| Data | Versão | Autor | Alteração |</w:t>
@@ -740,9 +892,16 @@
     </w:p>
     <w:p>
       <w:r>
-        <w:t>————————————————————————</w:t>
-      </w:r>
-    </w:p>
+        <w:t>| 2026-06-26 | 0.2 | JP-BR Insurance Knowledge Base | Inclusão de limite comercial/compliance para uso seguro em atendimento e NotebookLM. |</w:t>
+      </w:r>
+    </w:p>
+    <w:p/>
+    <w:p>
+      <w:r>
+        <w:br w:type="page"/>
+      </w:r>
+    </w:p>
+    <w:p/>
     <w:p>
       <w:pPr>
         <w:pStyle w:val="Heading1"/>
@@ -751,6 +910,7 @@
         <w:t>CASE-MED-0003 - Cliente não entende valor diário e limite de dias pagos</w:t>
       </w:r>
     </w:p>
+    <w:p/>
     <w:p>
       <w:pPr>
         <w:pStyle w:val="Heading2"/>
@@ -759,12 +919,13 @@
         <w:t>Controle</w:t>
       </w:r>
     </w:p>
+    <w:p/>
     <w:p>
       <w:pPr>
         <w:pStyle w:val="ListBullet"/>
       </w:pPr>
       <w:r>
-        <w:t>Versão: 0.1</w:t>
+        <w:t>Versão: 0.2</w:t>
       </w:r>
     </w:p>
     <w:p>
@@ -788,9 +949,10 @@
         <w:pStyle w:val="ListBullet"/>
       </w:pPr>
       <w:r>
-        <w:t>Histórico: Criação inicial.</w:t>
-      </w:r>
-    </w:p>
+        <w:t>Histórico: Criação inicial; inclusão de limite comercial/compliance.</w:t>
+      </w:r>
+    </w:p>
+    <w:p/>
     <w:p>
       <w:pPr>
         <w:pStyle w:val="Heading2"/>
@@ -799,11 +961,13 @@
         <w:t>Código</w:t>
       </w:r>
     </w:p>
+    <w:p/>
     <w:p>
       <w:r>
         <w:t>CASE-MED-0003</w:t>
       </w:r>
     </w:p>
+    <w:p/>
     <w:p>
       <w:pPr>
         <w:pStyle w:val="Heading2"/>
@@ -812,11 +976,13 @@
         <w:t>Produto ou categoria</w:t>
       </w:r>
     </w:p>
+    <w:p/>
     <w:p>
       <w:r>
         <w:t>MED</w:t>
       </w:r>
     </w:p>
+    <w:p/>
     <w:p>
       <w:pPr>
         <w:pStyle w:val="Heading2"/>
@@ -825,11 +991,13 @@
         <w:t>Situação</w:t>
       </w:r>
     </w:p>
+    <w:p/>
     <w:p>
       <w:r>
         <w:t>Cliente não entende valor diário e limite de dias pagos.</w:t>
       </w:r>
     </w:p>
+    <w:p/>
     <w:p>
       <w:pPr>
         <w:pStyle w:val="Heading2"/>
@@ -838,11 +1006,13 @@
         <w:t>Problema</w:t>
       </w:r>
     </w:p>
+    <w:p/>
     <w:p>
       <w:r>
         <w:t>Cliente pode confundir seguro médico privado com sistema público, benefício contratado ou reembolso amplo de despesas.</w:t>
       </w:r>
     </w:p>
+    <w:p/>
     <w:p>
       <w:pPr>
         <w:pStyle w:val="Heading2"/>
@@ -851,11 +1021,13 @@
         <w:t>Análise</w:t>
       </w:r>
     </w:p>
+    <w:p/>
     <w:p>
       <w:r>
         <w:t>O seguro médico privado deve ser explicado por benefício, condição de pagamento, limite, declaração de saúde e data de início.</w:t>
       </w:r>
     </w:p>
+    <w:p/>
     <w:p>
       <w:pPr>
         <w:pStyle w:val="Heading2"/>
@@ -864,11 +1036,13 @@
         <w:t>Orientação ao corretor</w:t>
       </w:r>
     </w:p>
+    <w:p/>
     <w:p>
       <w:r>
         <w:t>Confirmar objetivo do cliente, histórico de saúde, benefícios desejados e limites de cobertura antes de comparar preço.</w:t>
       </w:r>
     </w:p>
+    <w:p/>
     <w:p>
       <w:pPr>
         <w:pStyle w:val="Heading2"/>
@@ -877,11 +1051,13 @@
         <w:t>Como explicar ao cliente brasileiro</w:t>
       </w:r>
     </w:p>
+    <w:p/>
     <w:p>
       <w:r>
         <w:t>Vamos separar o que é sistema público e o que é benefício do seguro privado, porque cada um funciona de forma diferente.</w:t>
       </w:r>
     </w:p>
+    <w:p/>
     <w:p>
       <w:pPr>
         <w:pStyle w:val="Heading2"/>
@@ -890,19 +1066,37 @@
         <w:t>Resultado esperado</w:t>
       </w:r>
     </w:p>
+    <w:p/>
     <w:p>
       <w:r>
         <w:t>Cliente entende a finalidade do seguro médico e evita expectativa incorreta sobre pagamento.</w:t>
       </w:r>
     </w:p>
+    <w:p/>
     <w:p>
       <w:pPr>
         <w:pStyle w:val="Heading2"/>
       </w:pPr>
       <w:r>
+        <w:t>Limite comercial/compliance</w:t>
+      </w:r>
+    </w:p>
+    <w:p/>
+    <w:p>
+      <w:r>
+        <w:t>O corretor deve usar este caso como orientação de atendimento, sem prometer aceitação, cobertura, pagamento, prazo, diagnóstico, enquadramento médico ou resultado de análise. A decisão final depende do contrato, declaração de saúde, documentos médicos, datas relevantes e avaliação da seguradora.</w:t>
+      </w:r>
+    </w:p>
+    <w:p/>
+    <w:p>
+      <w:pPr>
+        <w:pStyle w:val="Heading2"/>
+      </w:pPr>
+      <w:r>
         <w:t>Termos relacionados</w:t>
       </w:r>
     </w:p>
+    <w:p/>
     <w:p>
       <w:pPr>
         <w:pStyle w:val="ListBullet"/>
@@ -935,6 +1129,7 @@
         <w:t>MED-0008 - 免責期間 - Período de carência ou não pagamento</w:t>
       </w:r>
     </w:p>
+    <w:p/>
     <w:p>
       <w:pPr>
         <w:pStyle w:val="Heading2"/>
@@ -943,6 +1138,7 @@
         <w:t>FAQs relacionadas</w:t>
       </w:r>
     </w:p>
+    <w:p/>
     <w:p>
       <w:pPr>
         <w:pStyle w:val="ListBullet"/>
@@ -975,6 +1171,7 @@
         <w:t>FAQ-MED-0008</w:t>
       </w:r>
     </w:p>
+    <w:p/>
     <w:p>
       <w:pPr>
         <w:pStyle w:val="Heading2"/>
@@ -983,6 +1180,7 @@
         <w:t>Diálogos relacionados</w:t>
       </w:r>
     </w:p>
+    <w:p/>
     <w:p>
       <w:pPr>
         <w:pStyle w:val="ListBullet"/>
@@ -991,6 +1189,7 @@
         <w:t>DIALOGUE-MED-0002</w:t>
       </w:r>
     </w:p>
+    <w:p/>
     <w:p>
       <w:pPr>
         <w:pStyle w:val="Heading2"/>
@@ -999,6 +1198,7 @@
         <w:t>Referências cruzadas</w:t>
       </w:r>
     </w:p>
+    <w:p/>
     <w:p>
       <w:pPr>
         <w:pStyle w:val="ListBullet"/>
@@ -1071,6 +1271,7 @@
         <w:t>DIALOGUE-MED-0002</w:t>
       </w:r>
     </w:p>
+    <w:p/>
     <w:p>
       <w:pPr>
         <w:pStyle w:val="Heading2"/>
@@ -1079,6 +1280,7 @@
         <w:t>Referências</w:t>
       </w:r>
     </w:p>
+    <w:p/>
     <w:p>
       <w:pPr>
         <w:pStyle w:val="ListBullet"/>
@@ -1087,6 +1289,7 @@
         <w:t>Documento interno: `EDITORIAL_RULES.md`</w:t>
       </w:r>
     </w:p>
+    <w:p/>
     <w:p>
       <w:pPr>
         <w:pStyle w:val="Heading2"/>
@@ -1095,6 +1298,7 @@
         <w:t>Tags</w:t>
       </w:r>
     </w:p>
+    <w:p/>
     <w:p>
       <w:pPr>
         <w:pStyle w:val="ListBullet"/>
@@ -1127,6 +1331,7 @@
         <w:t>atendimento</w:t>
       </w:r>
     </w:p>
+    <w:p/>
     <w:p>
       <w:pPr>
         <w:pStyle w:val="Heading2"/>
@@ -1135,6 +1340,7 @@
         <w:t>Veja também</w:t>
       </w:r>
     </w:p>
+    <w:p/>
     <w:p>
       <w:pPr>
         <w:pStyle w:val="ListBullet"/>
@@ -1143,6 +1349,7 @@
         <w:t>`14_FAQ/MED/FAQ-MED-0005.md`</w:t>
       </w:r>
     </w:p>
+    <w:p/>
     <w:p>
       <w:pPr>
         <w:pStyle w:val="Heading2"/>
@@ -1151,6 +1358,7 @@
         <w:t>Histórico de revisão</w:t>
       </w:r>
     </w:p>
+    <w:p/>
     <w:p>
       <w:r>
         <w:t>| Data | Versão | Autor | Alteração |</w:t>
@@ -1168,9 +1376,16 @@
     </w:p>
     <w:p>
       <w:r>
-        <w:t>————————————————————————</w:t>
-      </w:r>
-    </w:p>
+        <w:t>| 2026-06-26 | 0.2 | JP-BR Insurance Knowledge Base | Inclusão de limite comercial/compliance para uso seguro em atendimento e NotebookLM. |</w:t>
+      </w:r>
+    </w:p>
+    <w:p/>
+    <w:p>
+      <w:r>
+        <w:br w:type="page"/>
+      </w:r>
+    </w:p>
+    <w:p/>
     <w:p>
       <w:pPr>
         <w:pStyle w:val="Heading1"/>
@@ -1179,6 +1394,7 @@
         <w:t>CASE-MED-0004 - Cliente pergunta sobre tratamento médico avançado</w:t>
       </w:r>
     </w:p>
+    <w:p/>
     <w:p>
       <w:pPr>
         <w:pStyle w:val="Heading2"/>
@@ -1187,12 +1403,13 @@
         <w:t>Controle</w:t>
       </w:r>
     </w:p>
+    <w:p/>
     <w:p>
       <w:pPr>
         <w:pStyle w:val="ListBullet"/>
       </w:pPr>
       <w:r>
-        <w:t>Versão: 0.1</w:t>
+        <w:t>Versão: 0.2</w:t>
       </w:r>
     </w:p>
     <w:p>
@@ -1216,9 +1433,10 @@
         <w:pStyle w:val="ListBullet"/>
       </w:pPr>
       <w:r>
-        <w:t>Histórico: Criação inicial.</w:t>
-      </w:r>
-    </w:p>
+        <w:t>Histórico: Criação inicial; inclusão de limite comercial/compliance.</w:t>
+      </w:r>
+    </w:p>
+    <w:p/>
     <w:p>
       <w:pPr>
         <w:pStyle w:val="Heading2"/>
@@ -1227,11 +1445,13 @@
         <w:t>Código</w:t>
       </w:r>
     </w:p>
+    <w:p/>
     <w:p>
       <w:r>
         <w:t>CASE-MED-0004</w:t>
       </w:r>
     </w:p>
+    <w:p/>
     <w:p>
       <w:pPr>
         <w:pStyle w:val="Heading2"/>
@@ -1240,11 +1460,13 @@
         <w:t>Produto ou categoria</w:t>
       </w:r>
     </w:p>
+    <w:p/>
     <w:p>
       <w:r>
         <w:t>MED</w:t>
       </w:r>
     </w:p>
+    <w:p/>
     <w:p>
       <w:pPr>
         <w:pStyle w:val="Heading2"/>
@@ -1253,11 +1475,13 @@
         <w:t>Situação</w:t>
       </w:r>
     </w:p>
+    <w:p/>
     <w:p>
       <w:r>
         <w:t>Cliente pergunta sobre tratamento médico avançado.</w:t>
       </w:r>
     </w:p>
+    <w:p/>
     <w:p>
       <w:pPr>
         <w:pStyle w:val="Heading2"/>
@@ -1266,11 +1490,13 @@
         <w:t>Problema</w:t>
       </w:r>
     </w:p>
+    <w:p/>
     <w:p>
       <w:r>
         <w:t>Cliente pode confundir seguro médico privado com sistema público, benefício contratado ou reembolso amplo de despesas.</w:t>
       </w:r>
     </w:p>
+    <w:p/>
     <w:p>
       <w:pPr>
         <w:pStyle w:val="Heading2"/>
@@ -1279,11 +1505,13 @@
         <w:t>Análise</w:t>
       </w:r>
     </w:p>
+    <w:p/>
     <w:p>
       <w:r>
         <w:t>O seguro médico privado deve ser explicado por benefício, condição de pagamento, limite, declaração de saúde e data de início.</w:t>
       </w:r>
     </w:p>
+    <w:p/>
     <w:p>
       <w:pPr>
         <w:pStyle w:val="Heading2"/>
@@ -1292,11 +1520,13 @@
         <w:t>Orientação ao corretor</w:t>
       </w:r>
     </w:p>
+    <w:p/>
     <w:p>
       <w:r>
         <w:t>Confirmar objetivo do cliente, histórico de saúde, benefícios desejados e limites de cobertura antes de comparar preço.</w:t>
       </w:r>
     </w:p>
+    <w:p/>
     <w:p>
       <w:pPr>
         <w:pStyle w:val="Heading2"/>
@@ -1305,11 +1535,13 @@
         <w:t>Como explicar ao cliente brasileiro</w:t>
       </w:r>
     </w:p>
+    <w:p/>
     <w:p>
       <w:r>
         <w:t>Vamos separar o que é sistema público e o que é benefício do seguro privado, porque cada um funciona de forma diferente.</w:t>
       </w:r>
     </w:p>
+    <w:p/>
     <w:p>
       <w:pPr>
         <w:pStyle w:val="Heading2"/>
@@ -1318,19 +1550,37 @@
         <w:t>Resultado esperado</w:t>
       </w:r>
     </w:p>
+    <w:p/>
     <w:p>
       <w:r>
         <w:t>Cliente entende a finalidade do seguro médico e evita expectativa incorreta sobre pagamento.</w:t>
       </w:r>
     </w:p>
+    <w:p/>
     <w:p>
       <w:pPr>
         <w:pStyle w:val="Heading2"/>
       </w:pPr>
       <w:r>
+        <w:t>Limite comercial/compliance</w:t>
+      </w:r>
+    </w:p>
+    <w:p/>
+    <w:p>
+      <w:r>
+        <w:t>O corretor deve usar este caso como orientação de atendimento, sem prometer aceitação, cobertura, pagamento, prazo, diagnóstico, enquadramento médico ou resultado de análise. A decisão final depende do contrato, declaração de saúde, documentos médicos, datas relevantes e avaliação da seguradora.</w:t>
+      </w:r>
+    </w:p>
+    <w:p/>
+    <w:p>
+      <w:pPr>
+        <w:pStyle w:val="Heading2"/>
+      </w:pPr>
+      <w:r>
         <w:t>Termos relacionados</w:t>
       </w:r>
     </w:p>
+    <w:p/>
     <w:p>
       <w:pPr>
         <w:pStyle w:val="ListBullet"/>
@@ -1347,6 +1597,7 @@
         <w:t>MED-0010 - 先進医療給付金 - Benefício de tratamento médico avançado</w:t>
       </w:r>
     </w:p>
+    <w:p/>
     <w:p>
       <w:pPr>
         <w:pStyle w:val="Heading2"/>
@@ -1355,6 +1606,7 @@
         <w:t>FAQs relacionadas</w:t>
       </w:r>
     </w:p>
+    <w:p/>
     <w:p>
       <w:pPr>
         <w:pStyle w:val="ListBullet"/>
@@ -1371,6 +1623,7 @@
         <w:t>FAQ-MED-0010</w:t>
       </w:r>
     </w:p>
+    <w:p/>
     <w:p>
       <w:pPr>
         <w:pStyle w:val="Heading2"/>
@@ -1379,6 +1632,7 @@
         <w:t>Diálogos relacionados</w:t>
       </w:r>
     </w:p>
+    <w:p/>
     <w:p>
       <w:pPr>
         <w:pStyle w:val="ListBullet"/>
@@ -1387,6 +1641,7 @@
         <w:t>DIALOGUE-MED-0003</w:t>
       </w:r>
     </w:p>
+    <w:p/>
     <w:p>
       <w:pPr>
         <w:pStyle w:val="Heading2"/>
@@ -1395,6 +1650,7 @@
         <w:t>Referências cruzadas</w:t>
       </w:r>
     </w:p>
+    <w:p/>
     <w:p>
       <w:pPr>
         <w:pStyle w:val="ListBullet"/>
@@ -1435,6 +1691,7 @@
         <w:t>DIALOGUE-MED-0003</w:t>
       </w:r>
     </w:p>
+    <w:p/>
     <w:p>
       <w:pPr>
         <w:pStyle w:val="Heading2"/>
@@ -1443,6 +1700,7 @@
         <w:t>Referências</w:t>
       </w:r>
     </w:p>
+    <w:p/>
     <w:p>
       <w:pPr>
         <w:pStyle w:val="ListBullet"/>
@@ -1451,6 +1709,7 @@
         <w:t>Documento interno: `EDITORIAL_RULES.md`</w:t>
       </w:r>
     </w:p>
+    <w:p/>
     <w:p>
       <w:pPr>
         <w:pStyle w:val="Heading2"/>
@@ -1459,6 +1718,7 @@
         <w:t>Tags</w:t>
       </w:r>
     </w:p>
+    <w:p/>
     <w:p>
       <w:pPr>
         <w:pStyle w:val="ListBullet"/>
@@ -1491,6 +1751,7 @@
         <w:t>atendimento</w:t>
       </w:r>
     </w:p>
+    <w:p/>
     <w:p>
       <w:pPr>
         <w:pStyle w:val="Heading2"/>
@@ -1499,6 +1760,7 @@
         <w:t>Veja também</w:t>
       </w:r>
     </w:p>
+    <w:p/>
     <w:p>
       <w:pPr>
         <w:pStyle w:val="ListBullet"/>
@@ -1507,6 +1769,7 @@
         <w:t>`14_FAQ/MED/FAQ-MED-0009.md`</w:t>
       </w:r>
     </w:p>
+    <w:p/>
     <w:p>
       <w:pPr>
         <w:pStyle w:val="Heading2"/>
@@ -1515,6 +1778,7 @@
         <w:t>Histórico de revisão</w:t>
       </w:r>
     </w:p>
+    <w:p/>
     <w:p>
       <w:r>
         <w:t>| Data | Versão | Autor | Alteração |</w:t>
@@ -1532,9 +1796,16 @@
     </w:p>
     <w:p>
       <w:r>
-        <w:t>————————————————————————</w:t>
-      </w:r>
-    </w:p>
+        <w:t>| 2026-06-26 | 0.2 | JP-BR Insurance Knowledge Base | Inclusão de limite comercial/compliance para uso seguro em atendimento e NotebookLM. |</w:t>
+      </w:r>
+    </w:p>
+    <w:p/>
+    <w:p>
+      <w:r>
+        <w:br w:type="page"/>
+      </w:r>
+    </w:p>
+    <w:p/>
     <w:p>
       <w:pPr>
         <w:pStyle w:val="Heading1"/>
@@ -1543,6 +1814,7 @@
         <w:t>CASE-MED-0005 - Cliente quer cobertura para câncer e três doenças graves</w:t>
       </w:r>
     </w:p>
+    <w:p/>
     <w:p>
       <w:pPr>
         <w:pStyle w:val="Heading2"/>
@@ -1551,12 +1823,13 @@
         <w:t>Controle</w:t>
       </w:r>
     </w:p>
+    <w:p/>
     <w:p>
       <w:pPr>
         <w:pStyle w:val="ListBullet"/>
       </w:pPr>
       <w:r>
-        <w:t>Versão: 0.1</w:t>
+        <w:t>Versão: 0.2</w:t>
       </w:r>
     </w:p>
     <w:p>
@@ -1580,9 +1853,10 @@
         <w:pStyle w:val="ListBullet"/>
       </w:pPr>
       <w:r>
-        <w:t>Histórico: Criação inicial.</w:t>
-      </w:r>
-    </w:p>
+        <w:t>Histórico: Criação inicial; inclusão de limite comercial/compliance.</w:t>
+      </w:r>
+    </w:p>
+    <w:p/>
     <w:p>
       <w:pPr>
         <w:pStyle w:val="Heading2"/>
@@ -1591,11 +1865,13 @@
         <w:t>Código</w:t>
       </w:r>
     </w:p>
+    <w:p/>
     <w:p>
       <w:r>
         <w:t>CASE-MED-0005</w:t>
       </w:r>
     </w:p>
+    <w:p/>
     <w:p>
       <w:pPr>
         <w:pStyle w:val="Heading2"/>
@@ -1604,11 +1880,13 @@
         <w:t>Produto ou categoria</w:t>
       </w:r>
     </w:p>
+    <w:p/>
     <w:p>
       <w:r>
         <w:t>MED</w:t>
       </w:r>
     </w:p>
+    <w:p/>
     <w:p>
       <w:pPr>
         <w:pStyle w:val="Heading2"/>
@@ -1617,11 +1895,13 @@
         <w:t>Situação</w:t>
       </w:r>
     </w:p>
+    <w:p/>
     <w:p>
       <w:r>
         <w:t>Cliente quer cobertura para câncer e três doenças graves.</w:t>
       </w:r>
     </w:p>
+    <w:p/>
     <w:p>
       <w:pPr>
         <w:pStyle w:val="Heading2"/>
@@ -1630,11 +1910,13 @@
         <w:t>Problema</w:t>
       </w:r>
     </w:p>
+    <w:p/>
     <w:p>
       <w:r>
         <w:t>Cliente pode confundir seguro médico privado com sistema público, benefício contratado ou reembolso amplo de despesas.</w:t>
       </w:r>
     </w:p>
+    <w:p/>
     <w:p>
       <w:pPr>
         <w:pStyle w:val="Heading2"/>
@@ -1643,11 +1925,13 @@
         <w:t>Análise</w:t>
       </w:r>
     </w:p>
+    <w:p/>
     <w:p>
       <w:r>
         <w:t>O seguro médico privado deve ser explicado por benefício, condição de pagamento, limite, declaração de saúde e data de início.</w:t>
       </w:r>
     </w:p>
+    <w:p/>
     <w:p>
       <w:pPr>
         <w:pStyle w:val="Heading2"/>
@@ -1656,11 +1940,13 @@
         <w:t>Orientação ao corretor</w:t>
       </w:r>
     </w:p>
+    <w:p/>
     <w:p>
       <w:r>
         <w:t>Confirmar objetivo do cliente, histórico de saúde, benefícios desejados e limites de cobertura antes de comparar preço.</w:t>
       </w:r>
     </w:p>
+    <w:p/>
     <w:p>
       <w:pPr>
         <w:pStyle w:val="Heading2"/>
@@ -1669,11 +1955,13 @@
         <w:t>Como explicar ao cliente brasileiro</w:t>
       </w:r>
     </w:p>
+    <w:p/>
     <w:p>
       <w:r>
         <w:t>Vamos separar o que é sistema público e o que é benefício do seguro privado, porque cada um funciona de forma diferente.</w:t>
       </w:r>
     </w:p>
+    <w:p/>
     <w:p>
       <w:pPr>
         <w:pStyle w:val="Heading2"/>
@@ -1682,19 +1970,37 @@
         <w:t>Resultado esperado</w:t>
       </w:r>
     </w:p>
+    <w:p/>
     <w:p>
       <w:r>
         <w:t>Cliente entende a finalidade do seguro médico e evita expectativa incorreta sobre pagamento.</w:t>
       </w:r>
     </w:p>
+    <w:p/>
     <w:p>
       <w:pPr>
         <w:pStyle w:val="Heading2"/>
       </w:pPr>
       <w:r>
+        <w:t>Limite comercial/compliance</w:t>
+      </w:r>
+    </w:p>
+    <w:p/>
+    <w:p>
+      <w:r>
+        <w:t>O corretor deve usar este caso como orientação de atendimento, sem prometer aceitação, cobertura, pagamento, prazo, diagnóstico, enquadramento médico ou resultado de análise. A decisão final depende do contrato, declaração de saúde, documentos médicos, datas relevantes e avaliação da seguradora.</w:t>
+      </w:r>
+    </w:p>
+    <w:p/>
+    <w:p>
+      <w:pPr>
+        <w:pStyle w:val="Heading2"/>
+      </w:pPr>
+      <w:r>
         <w:t>Termos relacionados</w:t>
       </w:r>
     </w:p>
+    <w:p/>
     <w:p>
       <w:pPr>
         <w:pStyle w:val="ListBullet"/>
@@ -1711,6 +2017,7 @@
         <w:t>MED-0012 - 三大疾病保障 - Cobertura para três doenças graves</w:t>
       </w:r>
     </w:p>
+    <w:p/>
     <w:p>
       <w:pPr>
         <w:pStyle w:val="Heading2"/>
@@ -1719,6 +2026,7 @@
         <w:t>FAQs relacionadas</w:t>
       </w:r>
     </w:p>
+    <w:p/>
     <w:p>
       <w:pPr>
         <w:pStyle w:val="ListBullet"/>
@@ -1735,6 +2043,7 @@
         <w:t>FAQ-MED-0012</w:t>
       </w:r>
     </w:p>
+    <w:p/>
     <w:p>
       <w:pPr>
         <w:pStyle w:val="Heading2"/>
@@ -1743,6 +2052,7 @@
         <w:t>Diálogos relacionados</w:t>
       </w:r>
     </w:p>
+    <w:p/>
     <w:p>
       <w:pPr>
         <w:pStyle w:val="ListBullet"/>
@@ -1751,6 +2061,7 @@
         <w:t>DIALOGUE-MED-0003</w:t>
       </w:r>
     </w:p>
+    <w:p/>
     <w:p>
       <w:pPr>
         <w:pStyle w:val="Heading2"/>
@@ -1759,6 +2070,7 @@
         <w:t>Referências cruzadas</w:t>
       </w:r>
     </w:p>
+    <w:p/>
     <w:p>
       <w:pPr>
         <w:pStyle w:val="ListBullet"/>
@@ -1799,6 +2111,7 @@
         <w:t>DIALOGUE-MED-0003</w:t>
       </w:r>
     </w:p>
+    <w:p/>
     <w:p>
       <w:pPr>
         <w:pStyle w:val="Heading2"/>
@@ -1807,6 +2120,7 @@
         <w:t>Referências</w:t>
       </w:r>
     </w:p>
+    <w:p/>
     <w:p>
       <w:pPr>
         <w:pStyle w:val="ListBullet"/>
@@ -1815,6 +2129,7 @@
         <w:t>Documento interno: `EDITORIAL_RULES.md`</w:t>
       </w:r>
     </w:p>
+    <w:p/>
     <w:p>
       <w:pPr>
         <w:pStyle w:val="Heading2"/>
@@ -1823,6 +2138,7 @@
         <w:t>Tags</w:t>
       </w:r>
     </w:p>
+    <w:p/>
     <w:p>
       <w:pPr>
         <w:pStyle w:val="ListBullet"/>
@@ -1855,6 +2171,7 @@
         <w:t>atendimento</w:t>
       </w:r>
     </w:p>
+    <w:p/>
     <w:p>
       <w:pPr>
         <w:pStyle w:val="Heading2"/>
@@ -1863,6 +2180,7 @@
         <w:t>Veja também</w:t>
       </w:r>
     </w:p>
+    <w:p/>
     <w:p>
       <w:pPr>
         <w:pStyle w:val="ListBullet"/>
@@ -1871,6 +2189,7 @@
         <w:t>`14_FAQ/MED/FAQ-MED-0011.md`</w:t>
       </w:r>
     </w:p>
+    <w:p/>
     <w:p>
       <w:pPr>
         <w:pStyle w:val="Heading2"/>
@@ -1879,6 +2198,7 @@
         <w:t>Histórico de revisão</w:t>
       </w:r>
     </w:p>
+    <w:p/>
     <w:p>
       <w:r>
         <w:t>| Data | Versão | Autor | Alteração |</w:t>
@@ -1896,9 +2216,16 @@
     </w:p>
     <w:p>
       <w:r>
-        <w:t>————————————————————————</w:t>
-      </w:r>
-    </w:p>
+        <w:t>| 2026-06-26 | 0.2 | JP-BR Insurance Knowledge Base | Inclusão de limite comercial/compliance para uso seguro em atendimento e NotebookLM. |</w:t>
+      </w:r>
+    </w:p>
+    <w:p/>
+    <w:p>
+      <w:r>
+        <w:br w:type="page"/>
+      </w:r>
+    </w:p>
+    <w:p/>
     <w:p>
       <w:pPr>
         <w:pStyle w:val="Heading1"/>
@@ -1907,6 +2234,7 @@
         <w:t>CASE-MED-0006 - Cliente pergunta sobre doenças femininas, parto e complicações</w:t>
       </w:r>
     </w:p>
+    <w:p/>
     <w:p>
       <w:pPr>
         <w:pStyle w:val="Heading2"/>
@@ -1915,12 +2243,13 @@
         <w:t>Controle</w:t>
       </w:r>
     </w:p>
+    <w:p/>
     <w:p>
       <w:pPr>
         <w:pStyle w:val="ListBullet"/>
       </w:pPr>
       <w:r>
-        <w:t>Versão: 0.1</w:t>
+        <w:t>Versão: 0.2</w:t>
       </w:r>
     </w:p>
     <w:p>
@@ -1944,9 +2273,10 @@
         <w:pStyle w:val="ListBullet"/>
       </w:pPr>
       <w:r>
-        <w:t>Histórico: Criação inicial.</w:t>
-      </w:r>
-    </w:p>
+        <w:t>Histórico: Criação inicial; inclusão de limite comercial/compliance.</w:t>
+      </w:r>
+    </w:p>
+    <w:p/>
     <w:p>
       <w:pPr>
         <w:pStyle w:val="Heading2"/>
@@ -1955,11 +2285,13 @@
         <w:t>Código</w:t>
       </w:r>
     </w:p>
+    <w:p/>
     <w:p>
       <w:r>
         <w:t>CASE-MED-0006</w:t>
       </w:r>
     </w:p>
+    <w:p/>
     <w:p>
       <w:pPr>
         <w:pStyle w:val="Heading2"/>
@@ -1968,11 +2300,13 @@
         <w:t>Produto ou categoria</w:t>
       </w:r>
     </w:p>
+    <w:p/>
     <w:p>
       <w:r>
         <w:t>MED</w:t>
       </w:r>
     </w:p>
+    <w:p/>
     <w:p>
       <w:pPr>
         <w:pStyle w:val="Heading2"/>
@@ -1981,11 +2315,13 @@
         <w:t>Situação</w:t>
       </w:r>
     </w:p>
+    <w:p/>
     <w:p>
       <w:r>
         <w:t>Cliente pergunta sobre doenças femininas, parto e complicações.</w:t>
       </w:r>
     </w:p>
+    <w:p/>
     <w:p>
       <w:pPr>
         <w:pStyle w:val="Heading2"/>
@@ -1994,11 +2330,13 @@
         <w:t>Problema</w:t>
       </w:r>
     </w:p>
+    <w:p/>
     <w:p>
       <w:r>
         <w:t>Cliente pode confundir seguro médico privado com sistema público, benefício contratado ou reembolso amplo de despesas.</w:t>
       </w:r>
     </w:p>
+    <w:p/>
     <w:p>
       <w:pPr>
         <w:pStyle w:val="Heading2"/>
@@ -2007,11 +2345,13 @@
         <w:t>Análise</w:t>
       </w:r>
     </w:p>
+    <w:p/>
     <w:p>
       <w:r>
         <w:t>O seguro médico privado deve ser explicado por benefício, condição de pagamento, limite, declaração de saúde e data de início.</w:t>
       </w:r>
     </w:p>
+    <w:p/>
     <w:p>
       <w:pPr>
         <w:pStyle w:val="Heading2"/>
@@ -2020,11 +2360,13 @@
         <w:t>Orientação ao corretor</w:t>
       </w:r>
     </w:p>
+    <w:p/>
     <w:p>
       <w:r>
         <w:t>Confirmar objetivo do cliente, histórico de saúde, benefícios desejados e limites de cobertura antes de comparar preço.</w:t>
       </w:r>
     </w:p>
+    <w:p/>
     <w:p>
       <w:pPr>
         <w:pStyle w:val="Heading2"/>
@@ -2033,11 +2375,13 @@
         <w:t>Como explicar ao cliente brasileiro</w:t>
       </w:r>
     </w:p>
+    <w:p/>
     <w:p>
       <w:r>
         <w:t>Vamos separar o que é sistema público e o que é benefício do seguro privado, porque cada um funciona de forma diferente.</w:t>
       </w:r>
     </w:p>
+    <w:p/>
     <w:p>
       <w:pPr>
         <w:pStyle w:val="Heading2"/>
@@ -2046,19 +2390,37 @@
         <w:t>Resultado esperado</w:t>
       </w:r>
     </w:p>
+    <w:p/>
     <w:p>
       <w:r>
         <w:t>Cliente entende a finalidade do seguro médico e evita expectativa incorreta sobre pagamento.</w:t>
       </w:r>
     </w:p>
+    <w:p/>
     <w:p>
       <w:pPr>
         <w:pStyle w:val="Heading2"/>
       </w:pPr>
       <w:r>
+        <w:t>Limite comercial/compliance</w:t>
+      </w:r>
+    </w:p>
+    <w:p/>
+    <w:p>
+      <w:r>
+        <w:t>O corretor deve usar este caso como orientação de atendimento, sem prometer aceitação, cobertura, pagamento, prazo, diagnóstico, enquadramento médico ou resultado de análise. A decisão final depende do contrato, declaração de saúde, documentos médicos, datas relevantes e avaliação da seguradora.</w:t>
+      </w:r>
+    </w:p>
+    <w:p/>
+    <w:p>
+      <w:pPr>
+        <w:pStyle w:val="Heading2"/>
+      </w:pPr>
+      <w:r>
         <w:t>Termos relacionados</w:t>
       </w:r>
     </w:p>
+    <w:p/>
     <w:p>
       <w:pPr>
         <w:pStyle w:val="ListBullet"/>
@@ -2083,6 +2445,7 @@
         <w:t>MED-0016 - 異常分娩 - Parto com complicação</w:t>
       </w:r>
     </w:p>
+    <w:p/>
     <w:p>
       <w:pPr>
         <w:pStyle w:val="Heading2"/>
@@ -2091,6 +2454,7 @@
         <w:t>FAQs relacionadas</w:t>
       </w:r>
     </w:p>
+    <w:p/>
     <w:p>
       <w:pPr>
         <w:pStyle w:val="ListBullet"/>
@@ -2115,6 +2479,7 @@
         <w:t>FAQ-MED-0016</w:t>
       </w:r>
     </w:p>
+    <w:p/>
     <w:p>
       <w:pPr>
         <w:pStyle w:val="Heading2"/>
@@ -2123,6 +2488,7 @@
         <w:t>Diálogos relacionados</w:t>
       </w:r>
     </w:p>
+    <w:p/>
     <w:p>
       <w:pPr>
         <w:pStyle w:val="ListBullet"/>
@@ -2131,6 +2497,7 @@
         <w:t>DIALOGUE-MED-0004</w:t>
       </w:r>
     </w:p>
+    <w:p/>
     <w:p>
       <w:pPr>
         <w:pStyle w:val="Heading2"/>
@@ -2139,6 +2506,7 @@
         <w:t>Referências cruzadas</w:t>
       </w:r>
     </w:p>
+    <w:p/>
     <w:p>
       <w:pPr>
         <w:pStyle w:val="ListBullet"/>
@@ -2195,6 +2563,7 @@
         <w:t>DIALOGUE-MED-0004</w:t>
       </w:r>
     </w:p>
+    <w:p/>
     <w:p>
       <w:pPr>
         <w:pStyle w:val="Heading2"/>
@@ -2203,6 +2572,7 @@
         <w:t>Referências</w:t>
       </w:r>
     </w:p>
+    <w:p/>
     <w:p>
       <w:pPr>
         <w:pStyle w:val="ListBullet"/>
@@ -2211,6 +2581,7 @@
         <w:t>Documento interno: `EDITORIAL_RULES.md`</w:t>
       </w:r>
     </w:p>
+    <w:p/>
     <w:p>
       <w:pPr>
         <w:pStyle w:val="Heading2"/>
@@ -2219,6 +2590,7 @@
         <w:t>Tags</w:t>
       </w:r>
     </w:p>
+    <w:p/>
     <w:p>
       <w:pPr>
         <w:pStyle w:val="ListBullet"/>
@@ -2251,6 +2623,7 @@
         <w:t>atendimento</w:t>
       </w:r>
     </w:p>
+    <w:p/>
     <w:p>
       <w:pPr>
         <w:pStyle w:val="Heading2"/>
@@ -2259,6 +2632,7 @@
         <w:t>Veja também</w:t>
       </w:r>
     </w:p>
+    <w:p/>
     <w:p>
       <w:pPr>
         <w:pStyle w:val="ListBullet"/>
@@ -2267,6 +2641,7 @@
         <w:t>`14_FAQ/MED/FAQ-MED-0014.md`</w:t>
       </w:r>
     </w:p>
+    <w:p/>
     <w:p>
       <w:pPr>
         <w:pStyle w:val="Heading2"/>
@@ -2275,6 +2650,7 @@
         <w:t>Histórico de revisão</w:t>
       </w:r>
     </w:p>
+    <w:p/>
     <w:p>
       <w:r>
         <w:t>| Data | Versão | Autor | Alteração |</w:t>
@@ -2292,9 +2668,16 @@
     </w:p>
     <w:p>
       <w:r>
-        <w:t>————————————————————————</w:t>
-      </w:r>
-    </w:p>
+        <w:t>| 2026-06-26 | 0.2 | JP-BR Insurance Knowledge Base | Inclusão de limite comercial/compliance para uso seguro em atendimento e NotebookLM. |</w:t>
+      </w:r>
+    </w:p>
+    <w:p/>
+    <w:p>
+      <w:r>
+        <w:br w:type="page"/>
+      </w:r>
+    </w:p>
+    <w:p/>
     <w:p>
       <w:pPr>
         <w:pStyle w:val="Heading1"/>
@@ -2303,6 +2686,7 @@
         <w:t>CASE-MED-0007 - Cliente tem doença crônica ou transtorno mental</w:t>
       </w:r>
     </w:p>
+    <w:p/>
     <w:p>
       <w:pPr>
         <w:pStyle w:val="Heading2"/>
@@ -2311,12 +2695,13 @@
         <w:t>Controle</w:t>
       </w:r>
     </w:p>
+    <w:p/>
     <w:p>
       <w:pPr>
         <w:pStyle w:val="ListBullet"/>
       </w:pPr>
       <w:r>
-        <w:t>Versão: 0.1</w:t>
+        <w:t>Versão: 0.2</w:t>
       </w:r>
     </w:p>
     <w:p>
@@ -2340,9 +2725,10 @@
         <w:pStyle w:val="ListBullet"/>
       </w:pPr>
       <w:r>
-        <w:t>Histórico: Criação inicial.</w:t>
-      </w:r>
-    </w:p>
+        <w:t>Histórico: Criação inicial; inclusão de limite comercial/compliance.</w:t>
+      </w:r>
+    </w:p>
+    <w:p/>
     <w:p>
       <w:pPr>
         <w:pStyle w:val="Heading2"/>
@@ -2351,11 +2737,13 @@
         <w:t>Código</w:t>
       </w:r>
     </w:p>
+    <w:p/>
     <w:p>
       <w:r>
         <w:t>CASE-MED-0007</w:t>
       </w:r>
     </w:p>
+    <w:p/>
     <w:p>
       <w:pPr>
         <w:pStyle w:val="Heading2"/>
@@ -2364,11 +2752,13 @@
         <w:t>Produto ou categoria</w:t>
       </w:r>
     </w:p>
+    <w:p/>
     <w:p>
       <w:r>
         <w:t>MED</w:t>
       </w:r>
     </w:p>
+    <w:p/>
     <w:p>
       <w:pPr>
         <w:pStyle w:val="Heading2"/>
@@ -2377,11 +2767,13 @@
         <w:t>Situação</w:t>
       </w:r>
     </w:p>
+    <w:p/>
     <w:p>
       <w:r>
         <w:t>Cliente tem doença crônica ou transtorno mental.</w:t>
       </w:r>
     </w:p>
+    <w:p/>
     <w:p>
       <w:pPr>
         <w:pStyle w:val="Heading2"/>
@@ -2390,11 +2782,13 @@
         <w:t>Problema</w:t>
       </w:r>
     </w:p>
+    <w:p/>
     <w:p>
       <w:r>
         <w:t>Cliente pode confundir seguro médico privado com sistema público, benefício contratado ou reembolso amplo de despesas.</w:t>
       </w:r>
     </w:p>
+    <w:p/>
     <w:p>
       <w:pPr>
         <w:pStyle w:val="Heading2"/>
@@ -2403,11 +2797,13 @@
         <w:t>Análise</w:t>
       </w:r>
     </w:p>
+    <w:p/>
     <w:p>
       <w:r>
         <w:t>O seguro médico privado deve ser explicado por benefício, condição de pagamento, limite, declaração de saúde e data de início.</w:t>
       </w:r>
     </w:p>
+    <w:p/>
     <w:p>
       <w:pPr>
         <w:pStyle w:val="Heading2"/>
@@ -2416,11 +2812,13 @@
         <w:t>Orientação ao corretor</w:t>
       </w:r>
     </w:p>
+    <w:p/>
     <w:p>
       <w:r>
         <w:t>Confirmar objetivo do cliente, histórico de saúde, benefícios desejados e limites de cobertura antes de comparar preço.</w:t>
       </w:r>
     </w:p>
+    <w:p/>
     <w:p>
       <w:pPr>
         <w:pStyle w:val="Heading2"/>
@@ -2429,11 +2827,13 @@
         <w:t>Como explicar ao cliente brasileiro</w:t>
       </w:r>
     </w:p>
+    <w:p/>
     <w:p>
       <w:r>
         <w:t>Vamos separar o que é sistema público e o que é benefício do seguro privado, porque cada um funciona de forma diferente.</w:t>
       </w:r>
     </w:p>
+    <w:p/>
     <w:p>
       <w:pPr>
         <w:pStyle w:val="Heading2"/>
@@ -2442,19 +2842,37 @@
         <w:t>Resultado esperado</w:t>
       </w:r>
     </w:p>
+    <w:p/>
     <w:p>
       <w:r>
         <w:t>Cliente entende a finalidade do seguro médico e evita expectativa incorreta sobre pagamento.</w:t>
       </w:r>
     </w:p>
+    <w:p/>
     <w:p>
       <w:pPr>
         <w:pStyle w:val="Heading2"/>
       </w:pPr>
       <w:r>
+        <w:t>Limite comercial/compliance</w:t>
+      </w:r>
+    </w:p>
+    <w:p/>
+    <w:p>
+      <w:r>
+        <w:t>O corretor deve usar este caso como orientação de atendimento, sem prometer aceitação, cobertura, pagamento, prazo, diagnóstico, enquadramento médico ou resultado de análise. A decisão final depende do contrato, declaração de saúde, documentos médicos, datas relevantes e avaliação da seguradora.</w:t>
+      </w:r>
+    </w:p>
+    <w:p/>
+    <w:p>
+      <w:pPr>
+        <w:pStyle w:val="Heading2"/>
+      </w:pPr>
+      <w:r>
         <w:t>Termos relacionados</w:t>
       </w:r>
     </w:p>
+    <w:p/>
     <w:p>
       <w:pPr>
         <w:pStyle w:val="ListBullet"/>
@@ -2479,6 +2897,7 @@
         <w:t>MED-0019 - 告知義務 - Obrigação de declaração de saúde</w:t>
       </w:r>
     </w:p>
+    <w:p/>
     <w:p>
       <w:pPr>
         <w:pStyle w:val="Heading2"/>
@@ -2487,6 +2906,7 @@
         <w:t>FAQs relacionadas</w:t>
       </w:r>
     </w:p>
+    <w:p/>
     <w:p>
       <w:pPr>
         <w:pStyle w:val="ListBullet"/>
@@ -2511,6 +2931,7 @@
         <w:t>FAQ-MED-0019</w:t>
       </w:r>
     </w:p>
+    <w:p/>
     <w:p>
       <w:pPr>
         <w:pStyle w:val="Heading2"/>
@@ -2519,6 +2940,7 @@
         <w:t>Diálogos relacionados</w:t>
       </w:r>
     </w:p>
+    <w:p/>
     <w:p>
       <w:pPr>
         <w:pStyle w:val="ListBullet"/>
@@ -2527,6 +2949,7 @@
         <w:t>DIALOGUE-MED-0005</w:t>
       </w:r>
     </w:p>
+    <w:p/>
     <w:p>
       <w:pPr>
         <w:pStyle w:val="Heading2"/>
@@ -2535,6 +2958,7 @@
         <w:t>Referências cruzadas</w:t>
       </w:r>
     </w:p>
+    <w:p/>
     <w:p>
       <w:pPr>
         <w:pStyle w:val="ListBullet"/>
@@ -2591,6 +3015,7 @@
         <w:t>DIALOGUE-MED-0005</w:t>
       </w:r>
     </w:p>
+    <w:p/>
     <w:p>
       <w:pPr>
         <w:pStyle w:val="Heading2"/>
@@ -2599,6 +3024,7 @@
         <w:t>Referências</w:t>
       </w:r>
     </w:p>
+    <w:p/>
     <w:p>
       <w:pPr>
         <w:pStyle w:val="ListBullet"/>
@@ -2607,6 +3033,7 @@
         <w:t>Documento interno: `EDITORIAL_RULES.md`</w:t>
       </w:r>
     </w:p>
+    <w:p/>
     <w:p>
       <w:pPr>
         <w:pStyle w:val="Heading2"/>
@@ -2615,6 +3042,7 @@
         <w:t>Tags</w:t>
       </w:r>
     </w:p>
+    <w:p/>
     <w:p>
       <w:pPr>
         <w:pStyle w:val="ListBullet"/>
@@ -2647,6 +3075,7 @@
         <w:t>atendimento</w:t>
       </w:r>
     </w:p>
+    <w:p/>
     <w:p>
       <w:pPr>
         <w:pStyle w:val="Heading2"/>
@@ -2655,6 +3084,7 @@
         <w:t>Veja também</w:t>
       </w:r>
     </w:p>
+    <w:p/>
     <w:p>
       <w:pPr>
         <w:pStyle w:val="ListBullet"/>
@@ -2663,6 +3093,7 @@
         <w:t>`14_FAQ/MED/FAQ-MED-0017.md`</w:t>
       </w:r>
     </w:p>
+    <w:p/>
     <w:p>
       <w:pPr>
         <w:pStyle w:val="Heading2"/>
@@ -2671,6 +3102,7 @@
         <w:t>Histórico de revisão</w:t>
       </w:r>
     </w:p>
+    <w:p/>
     <w:p>
       <w:r>
         <w:t>| Data | Versão | Autor | Alteração |</w:t>
@@ -2688,9 +3120,16 @@
     </w:p>
     <w:p>
       <w:r>
-        <w:t>————————————————————————</w:t>
-      </w:r>
-    </w:p>
+        <w:t>| 2026-06-26 | 0.2 | JP-BR Insurance Knowledge Base | Inclusão de limite comercial/compliance para uso seguro em atendimento e NotebookLM. |</w:t>
+      </w:r>
+    </w:p>
+    <w:p/>
+    <w:p>
+      <w:r>
+        <w:br w:type="page"/>
+      </w:r>
+    </w:p>
+    <w:p/>
     <w:p>
       <w:pPr>
         <w:pStyle w:val="Heading1"/>
@@ -2699,6 +3138,7 @@
         <w:t>CASE-MED-0008 - Cliente acha que cobertura começa imediatamente</w:t>
       </w:r>
     </w:p>
+    <w:p/>
     <w:p>
       <w:pPr>
         <w:pStyle w:val="Heading2"/>
@@ -2707,12 +3147,13 @@
         <w:t>Controle</w:t>
       </w:r>
     </w:p>
+    <w:p/>
     <w:p>
       <w:pPr>
         <w:pStyle w:val="ListBullet"/>
       </w:pPr>
       <w:r>
-        <w:t>Versão: 0.1</w:t>
+        <w:t>Versão: 0.2</w:t>
       </w:r>
     </w:p>
     <w:p>
@@ -2736,9 +3177,10 @@
         <w:pStyle w:val="ListBullet"/>
       </w:pPr>
       <w:r>
-        <w:t>Histórico: Criação inicial.</w:t>
-      </w:r>
-    </w:p>
+        <w:t>Histórico: Criação inicial; inclusão de limite comercial/compliance.</w:t>
+      </w:r>
+    </w:p>
+    <w:p/>
     <w:p>
       <w:pPr>
         <w:pStyle w:val="Heading2"/>
@@ -2747,11 +3189,13 @@
         <w:t>Código</w:t>
       </w:r>
     </w:p>
+    <w:p/>
     <w:p>
       <w:r>
         <w:t>CASE-MED-0008</w:t>
       </w:r>
     </w:p>
+    <w:p/>
     <w:p>
       <w:pPr>
         <w:pStyle w:val="Heading2"/>
@@ -2760,11 +3204,13 @@
         <w:t>Produto ou categoria</w:t>
       </w:r>
     </w:p>
+    <w:p/>
     <w:p>
       <w:r>
         <w:t>MED</w:t>
       </w:r>
     </w:p>
+    <w:p/>
     <w:p>
       <w:pPr>
         <w:pStyle w:val="Heading2"/>
@@ -2773,11 +3219,13 @@
         <w:t>Situação</w:t>
       </w:r>
     </w:p>
+    <w:p/>
     <w:p>
       <w:r>
         <w:t>Cliente acha que cobertura começa imediatamente.</w:t>
       </w:r>
     </w:p>
+    <w:p/>
     <w:p>
       <w:pPr>
         <w:pStyle w:val="Heading2"/>
@@ -2786,11 +3234,13 @@
         <w:t>Problema</w:t>
       </w:r>
     </w:p>
+    <w:p/>
     <w:p>
       <w:r>
         <w:t>Cliente pode confundir seguro médico privado com sistema público, benefício contratado ou reembolso amplo de despesas.</w:t>
       </w:r>
     </w:p>
+    <w:p/>
     <w:p>
       <w:pPr>
         <w:pStyle w:val="Heading2"/>
@@ -2799,11 +3249,13 @@
         <w:t>Análise</w:t>
       </w:r>
     </w:p>
+    <w:p/>
     <w:p>
       <w:r>
         <w:t>O seguro médico privado deve ser explicado por benefício, condição de pagamento, limite, declaração de saúde e data de início.</w:t>
       </w:r>
     </w:p>
+    <w:p/>
     <w:p>
       <w:pPr>
         <w:pStyle w:val="Heading2"/>
@@ -2812,11 +3264,13 @@
         <w:t>Orientação ao corretor</w:t>
       </w:r>
     </w:p>
+    <w:p/>
     <w:p>
       <w:r>
         <w:t>Confirmar objetivo do cliente, histórico de saúde, benefícios desejados e limites de cobertura antes de comparar preço.</w:t>
       </w:r>
     </w:p>
+    <w:p/>
     <w:p>
       <w:pPr>
         <w:pStyle w:val="Heading2"/>
@@ -2825,11 +3279,13 @@
         <w:t>Como explicar ao cliente brasileiro</w:t>
       </w:r>
     </w:p>
+    <w:p/>
     <w:p>
       <w:r>
         <w:t>Vamos separar o que é sistema público e o que é benefício do seguro privado, porque cada um funciona de forma diferente.</w:t>
       </w:r>
     </w:p>
+    <w:p/>
     <w:p>
       <w:pPr>
         <w:pStyle w:val="Heading2"/>
@@ -2838,19 +3294,37 @@
         <w:t>Resultado esperado</w:t>
       </w:r>
     </w:p>
+    <w:p/>
     <w:p>
       <w:r>
         <w:t>Cliente entende a finalidade do seguro médico e evita expectativa incorreta sobre pagamento.</w:t>
       </w:r>
     </w:p>
+    <w:p/>
     <w:p>
       <w:pPr>
         <w:pStyle w:val="Heading2"/>
       </w:pPr>
       <w:r>
+        <w:t>Limite comercial/compliance</w:t>
+      </w:r>
+    </w:p>
+    <w:p/>
+    <w:p>
+      <w:r>
+        <w:t>O corretor deve usar este caso como orientação de atendimento, sem prometer aceitação, cobertura, pagamento, prazo, diagnóstico, enquadramento médico ou resultado de análise. A decisão final depende do contrato, declaração de saúde, documentos médicos, datas relevantes e avaliação da seguradora.</w:t>
+      </w:r>
+    </w:p>
+    <w:p/>
+    <w:p>
+      <w:pPr>
+        <w:pStyle w:val="Heading2"/>
+      </w:pPr>
+      <w:r>
         <w:t>Termos relacionados</w:t>
       </w:r>
     </w:p>
+    <w:p/>
     <w:p>
       <w:pPr>
         <w:pStyle w:val="ListBullet"/>
@@ -2867,6 +3341,7 @@
         <w:t>MED-0020 - 責任開始日 - Data de início da cobertura</w:t>
       </w:r>
     </w:p>
+    <w:p/>
     <w:p>
       <w:pPr>
         <w:pStyle w:val="Heading2"/>
@@ -2875,6 +3350,7 @@
         <w:t>FAQs relacionadas</w:t>
       </w:r>
     </w:p>
+    <w:p/>
     <w:p>
       <w:pPr>
         <w:pStyle w:val="ListBullet"/>
@@ -2891,6 +3367,7 @@
         <w:t>FAQ-MED-0020</w:t>
       </w:r>
     </w:p>
+    <w:p/>
     <w:p>
       <w:pPr>
         <w:pStyle w:val="Heading2"/>
@@ -2899,6 +3376,7 @@
         <w:t>Diálogos relacionados</w:t>
       </w:r>
     </w:p>
+    <w:p/>
     <w:p>
       <w:pPr>
         <w:pStyle w:val="ListBullet"/>
@@ -2907,6 +3385,7 @@
         <w:t>DIALOGUE-MED-0005</w:t>
       </w:r>
     </w:p>
+    <w:p/>
     <w:p>
       <w:pPr>
         <w:pStyle w:val="Heading2"/>
@@ -2915,6 +3394,7 @@
         <w:t>Referências cruzadas</w:t>
       </w:r>
     </w:p>
+    <w:p/>
     <w:p>
       <w:pPr>
         <w:pStyle w:val="ListBullet"/>
@@ -2955,6 +3435,7 @@
         <w:t>DIALOGUE-MED-0005</w:t>
       </w:r>
     </w:p>
+    <w:p/>
     <w:p>
       <w:pPr>
         <w:pStyle w:val="Heading2"/>
@@ -2963,6 +3444,7 @@
         <w:t>Referências</w:t>
       </w:r>
     </w:p>
+    <w:p/>
     <w:p>
       <w:pPr>
         <w:pStyle w:val="ListBullet"/>
@@ -2971,6 +3453,7 @@
         <w:t>Documento interno: `EDITORIAL_RULES.md`</w:t>
       </w:r>
     </w:p>
+    <w:p/>
     <w:p>
       <w:pPr>
         <w:pStyle w:val="Heading2"/>
@@ -2979,6 +3462,7 @@
         <w:t>Tags</w:t>
       </w:r>
     </w:p>
+    <w:p/>
     <w:p>
       <w:pPr>
         <w:pStyle w:val="ListBullet"/>
@@ -3011,6 +3495,7 @@
         <w:t>atendimento</w:t>
       </w:r>
     </w:p>
+    <w:p/>
     <w:p>
       <w:pPr>
         <w:pStyle w:val="Heading2"/>
@@ -3019,6 +3504,7 @@
         <w:t>Veja também</w:t>
       </w:r>
     </w:p>
+    <w:p/>
     <w:p>
       <w:pPr>
         <w:pStyle w:val="ListBullet"/>
@@ -3027,6 +3513,7 @@
         <w:t>`14_FAQ/MED/FAQ-MED-0019.md`</w:t>
       </w:r>
     </w:p>
+    <w:p/>
     <w:p>
       <w:pPr>
         <w:pStyle w:val="Heading2"/>
@@ -3035,6 +3522,7 @@
         <w:t>Histórico de revisão</w:t>
       </w:r>
     </w:p>
+    <w:p/>
     <w:p>
       <w:r>
         <w:t>| Data | Versão | Autor | Alteração |</w:t>
@@ -3048,6 +3536,36 @@
     <w:p>
       <w:r>
         <w:t>| 2026-06-26 | 0.1 | JP-BR Insurance Knowledge Base | Criação inicial. |</w:t>
+      </w:r>
+    </w:p>
+    <w:p>
+      <w:r>
+        <w:t>| 2026-06-26 | 0.2 | JP-BR Insurance Knowledge Base | Inclusão de limite comercial/compliance para uso seguro em atendimento e NotebookLM. |</w:t>
+      </w:r>
+    </w:p>
+    <w:p/>
+    <w:p>
+      <w:pPr>
+        <w:pStyle w:val="Heading2"/>
+      </w:pPr>
+      <w:r>
+        <w:t>Histórico de revisão</w:t>
+      </w:r>
+    </w:p>
+    <w:p/>
+    <w:p>
+      <w:r>
+        <w:t>| Data | Versão | Autor | Alteração |</w:t>
+      </w:r>
+    </w:p>
+    <w:p>
+      <w:r>
+        <w:t>| --- | --- | --- | --- |</w:t>
+      </w:r>
+    </w:p>
+    <w:p>
+      <w:r>
+        <w:t>| 2026-06-26 | 0.2 | JP-BR Insurance Knowledge Base | Regeneração do pacote com normalização de compliance dos estudos de caso MED. |</w:t>
       </w:r>
     </w:p>
     <w:sectPr>
@@ -3424,7 +3942,7 @@
     <w:qFormat/>
     <w:rsid w:val="00FC693F"/>
     <w:rPr>
-      <w:rFonts w:ascii="Arial Unicode MS" w:hAnsi="Arial Unicode MS"/>
+      <w:rFonts w:ascii="Arial" w:hAnsi="Arial"/>
       <w:sz w:val="20"/>
     </w:rPr>
   </w:style>

</xml_diff>